<commit_message>
Fix test artifact clobbering, restore verified outputs, clean repo
- test_graph_smoke.py: redirect finalize output writes to tmp_path so
  mocked graph runs can no longer overwrite the real lesson_output.md
  and rejection_log.json (root cause of the corrupted diagnostic-draft
  artifacts committed earlier)
- output/: fresh artifacts from live runs — clean run passed on
  attempt 1 (Flesch 63.8), inject-error demo run failed jargon/grounding
  and passed on attempt 3 with a full corrections trace
- FINAL_INTRODUCTION_TO_RAG_LESSON.docx: rebuilt from the accepted
  lesson content (assets/create_docx.py), consistent with lesson_output.md
- repo hygiene: remove stale internal audit reports and debug scripts,
  move docx/infographic build files to assets/, keep Loom scripts local
</commit_message>
<xml_diff>
--- a/FINAL_INTRODUCTION_TO_RAG_LESSON.docx
+++ b/FINAL_INTRODUCTION_TO_RAG_LESSON.docx
@@ -20,7 +20,16 @@
           <w:rFonts w:ascii="Arial" w:hAnsi="Arial"/>
           <w:sz w:val="22"/>
         </w:rPr>
-        <w:t>Welcome to your AI learning journey! If you want to build a career in Artificial Intelligence, you are in the right place. Today, we will learn about a very important AI technique called RAG. By the end of this lesson, you will understand what RAG is, why it matters, and how it works.</w:t>
+        <w:t>Welcome to your AI learning journey! Today, we will learn about a very useful technology called RAG.</w:t>
+      </w:r>
+    </w:p>
+    <w:p>
+      <w:r>
+        <w:rPr>
+          <w:rFonts w:ascii="Arial" w:hAnsi="Arial"/>
+          <w:sz w:val="22"/>
+        </w:rPr>
+        <w:t>If you want to build a career in AI, understanding RAG is a big step forward. Let us break it down step by step in simple English.</w:t>
       </w:r>
     </w:p>
     <w:p>
@@ -49,7 +58,7 @@
           <w:rFonts w:ascii="Arial" w:hAnsi="Arial"/>
           <w:sz w:val="22"/>
         </w:rPr>
-        <w:t>That is a big phrase. Let us break it down into simple parts:</w:t>
+        <w:t>Do not worry about these big words. Let us split them up:</w:t>
       </w:r>
     </w:p>
     <w:p>
@@ -69,27 +78,7 @@
           <w:rFonts w:ascii="Arial" w:hAnsi="Arial"/>
           <w:sz w:val="22"/>
         </w:rPr>
-        <w:t>: Finding the right documents or information from a knowledge base. A knowledge base is a collected set of information, like a digital library or a folder of notes.</w:t>
-      </w:r>
-    </w:p>
-    <w:p>
-      <w:pPr>
-        <w:pStyle w:val="ListBullet"/>
-      </w:pPr>
-      <w:r>
-        <w:rPr>
-          <w:rFonts w:ascii="Arial" w:hAnsi="Arial"/>
-          <w:b/>
-          <w:sz w:val="22"/>
-        </w:rPr>
-        <w:t>Augmented</w:t>
-      </w:r>
-      <w:r>
-        <w:rPr>
-          <w:rFonts w:ascii="Arial" w:hAnsi="Arial"/>
-          <w:sz w:val="22"/>
-        </w:rPr>
-        <w:t>: Adding or combining that found information to help the AI.</w:t>
+        <w:t>: Finding the right information from a collection of documents.</w:t>
       </w:r>
     </w:p>
     <w:p>
@@ -109,7 +98,7 @@
           <w:rFonts w:ascii="Arial" w:hAnsi="Arial"/>
           <w:sz w:val="22"/>
         </w:rPr>
-        <w:t>: Making a clear, helpful answer for the user.</w:t>
+        <w:t>: Creating a human-like answer using AI.</w:t>
       </w:r>
     </w:p>
     <w:p>
@@ -118,7 +107,7 @@
           <w:rFonts w:ascii="Arial" w:hAnsi="Arial"/>
           <w:sz w:val="22"/>
         </w:rPr>
-        <w:t>Before we continue, let us talk about what an LLM is. LLM stands for Large Language Model. It is a type of AI trained on a massive amount of text to understand and generate human language.</w:t>
+        <w:t>An LLM (Large Language Model) is a computer program trained on a huge amount of text. It can talk, write essays, and answer questions.</w:t>
       </w:r>
     </w:p>
     <w:p>
@@ -127,7 +116,7 @@
           <w:rFonts w:ascii="Arial" w:hAnsi="Arial"/>
           <w:sz w:val="22"/>
         </w:rPr>
-        <w:t>Think of RAG like a student taking an open-book exam.</w:t>
+        <w:t>Think of an LLM as a very smart student who read many books in the past. But this student is taking a closed-book exam. They can only use their memory.</w:t>
       </w:r>
     </w:p>
     <w:p>
@@ -136,7 +125,7 @@
           <w:rFonts w:ascii="Arial" w:hAnsi="Arial"/>
           <w:sz w:val="22"/>
         </w:rPr>
-        <w:t>Imagine you are writing an exam. If the teacher asks a hard question, you do not just guess from memory. You open your textbook, find the correct page, read the facts, and then write your answer.</w:t>
+        <w:t>RAG gives this smart student an open book during the exam.</w:t>
       </w:r>
     </w:p>
     <w:p>
@@ -145,7 +134,7 @@
           <w:rFonts w:ascii="Arial" w:hAnsi="Arial"/>
           <w:sz w:val="22"/>
         </w:rPr>
-        <w:t>RAG lets an AI do the exact same thing. Instead of guessing blindly, the AI looks at a trusted source first. Then, it writes an answer based on that source.</w:t>
+        <w:t>Analogy: Imagine you work at a new job. Your boss asks you a question about company rules. Without RAG, you guess the answer from memory. With RAG, you quickly look at the company rulebook on your desk and give the exact answer. RAG is like giving the AI a search tool and a library to use before it replies.</w:t>
       </w:r>
     </w:p>
     <w:p>
@@ -156,7 +145,7 @@
         <w:rPr>
           <w:rFonts w:ascii="Arial" w:hAnsi="Arial"/>
         </w:rPr>
-        <w:t>2. Why does RAG matter?</w:t>
+        <w:t>2. Why do we need RAG?</w:t>
       </w:r>
     </w:p>
     <w:p>
@@ -165,7 +154,7 @@
           <w:rFonts w:ascii="Arial" w:hAnsi="Arial"/>
           <w:sz w:val="22"/>
         </w:rPr>
-        <w:t>To understand why RAG is useful, we must look at how standard AI models work. An AI model learns from a huge amount of data during its training. But an AI working only from its existing knowledge has two big limits:</w:t>
+        <w:t>LLMs are very powerful, but they have two big limits:</w:t>
       </w:r>
     </w:p>
     <w:p>
@@ -178,14 +167,14 @@
           <w:b/>
           <w:sz w:val="22"/>
         </w:rPr>
-        <w:t>Outdated information:</w:t>
+        <w:t>Limit 1:</w:t>
       </w:r>
       <w:r>
         <w:rPr>
           <w:rFonts w:ascii="Arial" w:hAnsi="Arial"/>
           <w:sz w:val="22"/>
         </w:rPr>
-        <w:t xml:space="preserve"> It can become old. The AI does not know about news or updates that happened after its training ended.</w:t>
+        <w:t xml:space="preserve"> They only know what they learned during training. They do not know new facts or private company data.</w:t>
       </w:r>
     </w:p>
     <w:p>
@@ -198,14 +187,14 @@
           <w:b/>
           <w:sz w:val="22"/>
         </w:rPr>
-        <w:t>No private information:</w:t>
+        <w:t>Limit 2:</w:t>
       </w:r>
       <w:r>
         <w:rPr>
           <w:rFonts w:ascii="Arial" w:hAnsi="Arial"/>
           <w:sz w:val="22"/>
         </w:rPr>
-        <w:t xml:space="preserve"> A public AI does not know your company's secret product manual or your personal notes.</w:t>
+        <w:t xml:space="preserve"> Sometimes, an AI makes mistakes. A hallucination is when an AI gives an answer that sounds confident but contains incorrect or unsupported information.</w:t>
       </w:r>
     </w:p>
     <w:p>
@@ -214,7 +203,7 @@
           <w:rFonts w:ascii="Arial" w:hAnsi="Arial"/>
           <w:sz w:val="22"/>
         </w:rPr>
-        <w:t>Because of these limits, AI models can sometimes suffer from a hallucination. A hallucination is when an AI gives an answer that sounds confident but contains incorrect or completely made-up information. Think of an AI without RAG like a smart person who refuses to check the calendar or a map. They might talk very smoothly, but they can still give you the wrong date or get lost.</w:t>
+        <w:t>Also, an LLM has a context window. A context window is the amount of information a model can consider at one time when generating an answer. It cannot read a million books all at once.</w:t>
       </w:r>
     </w:p>
     <w:p>
@@ -223,7 +212,16 @@
           <w:rFonts w:ascii="Arial" w:hAnsi="Arial"/>
           <w:sz w:val="22"/>
         </w:rPr>
-        <w:t>RAG matters because retrieving relevant, external information gives the AI the exact facts it needs. This helps the AI give more accurate answers using up-to-date and specific facts, though it does not completely prevent all hallucinations.</w:t>
+        <w:t>Analogy: Imagine asking a famous chef how to make a secret local dish from your town. If the chef never visited your town, they might guess the recipe. They might sound very sure of themselves, but the food will taste wrong. RAG gives the chef the actual local recipe first so they can cook the correct dish.</w:t>
+      </w:r>
+    </w:p>
+    <w:p>
+      <w:r>
+        <w:rPr>
+          <w:rFonts w:ascii="Arial" w:hAnsi="Arial"/>
+          <w:sz w:val="22"/>
+        </w:rPr>
+        <w:t>RAG matters because it helps the AI look at real facts before replying. This can reduce the chance of unsupported answers.</w:t>
       </w:r>
     </w:p>
     <w:p>
@@ -243,7 +241,56 @@
           <w:rFonts w:ascii="Arial" w:hAnsi="Arial"/>
           <w:sz w:val="22"/>
         </w:rPr>
-        <w:t>A RAG system works in a simple step-by-step flow:</w:t>
+        <w:t>A RAG system works in three main steps:</w:t>
+      </w:r>
+    </w:p>
+    <w:p>
+      <w:pPr>
+        <w:pStyle w:val="Heading2"/>
+      </w:pPr>
+      <w:r>
+        <w:rPr>
+          <w:rFonts w:ascii="Arial" w:hAnsi="Arial"/>
+        </w:rPr>
+        <w:t>Step 1: Building a Knowledge Base</w:t>
+      </w:r>
+    </w:p>
+    <w:p>
+      <w:r>
+        <w:rPr>
+          <w:rFonts w:ascii="Arial" w:hAnsi="Arial"/>
+          <w:sz w:val="22"/>
+        </w:rPr>
+        <w:t>First, you gather your documents, manuals, or notes. This is your knowledge base, which is a collection of information used to help answer questions.</w:t>
+      </w:r>
+    </w:p>
+    <w:p>
+      <w:pPr>
+        <w:pStyle w:val="Heading2"/>
+      </w:pPr>
+      <w:r>
+        <w:rPr>
+          <w:rFonts w:ascii="Arial" w:hAnsi="Arial"/>
+        </w:rPr>
+        <w:t>Step 2: Retrieval (Finding the Data)</w:t>
+      </w:r>
+    </w:p>
+    <w:p>
+      <w:r>
+        <w:rPr>
+          <w:rFonts w:ascii="Arial" w:hAnsi="Arial"/>
+          <w:sz w:val="22"/>
+        </w:rPr>
+        <w:t>When a user asks a question, the system searches the knowledge base for the most helpful parts. This step is called retrieval, which is the process of finding and pulling out relevant information from a larger set of files.</w:t>
+      </w:r>
+    </w:p>
+    <w:p>
+      <w:r>
+        <w:rPr>
+          <w:rFonts w:ascii="Arial" w:hAnsi="Arial"/>
+          <w:sz w:val="22"/>
+        </w:rPr>
+        <w:t>To make search fast and smart, computers use embeddings and vectors.</w:t>
       </w:r>
     </w:p>
     <w:p>
@@ -256,14 +303,14 @@
           <w:b/>
           <w:sz w:val="22"/>
         </w:rPr>
-        <w:t>Step 1:</w:t>
+        <w:t>Embedding:</w:t>
       </w:r>
       <w:r>
         <w:rPr>
           <w:rFonts w:ascii="Arial" w:hAnsi="Arial"/>
           <w:sz w:val="22"/>
         </w:rPr>
-        <w:t xml:space="preserve"> The user asks a question.</w:t>
+        <w:t xml:space="preserve"> An embedding is a way to turn words and sentences into lists of numbers so a computer can understand their meaning.</w:t>
       </w:r>
     </w:p>
     <w:p>
@@ -276,54 +323,23 @@
           <w:b/>
           <w:sz w:val="22"/>
         </w:rPr>
-        <w:t>Step 2:</w:t>
+        <w:t>Vector:</w:t>
       </w:r>
       <w:r>
         <w:rPr>
           <w:rFonts w:ascii="Arial" w:hAnsi="Arial"/>
           <w:sz w:val="22"/>
         </w:rPr>
-        <w:t xml:space="preserve"> The system searches the external knowledge base to find the most useful and relevant pieces of information.</w:t>
+        <w:t xml:space="preserve"> A vector is a list of numbers that represents the meaning of a piece of text.</w:t>
       </w:r>
     </w:p>
     <w:p>
-      <w:pPr>
-        <w:pStyle w:val="ListBullet"/>
-      </w:pPr>
-      <w:r>
-        <w:rPr>
-          <w:rFonts w:ascii="Arial" w:hAnsi="Arial"/>
-          <w:b/>
-          <w:sz w:val="22"/>
-        </w:rPr>
-        <w:t>Step 3:</w:t>
-      </w:r>
       <w:r>
         <w:rPr>
           <w:rFonts w:ascii="Arial" w:hAnsi="Arial"/>
           <w:sz w:val="22"/>
         </w:rPr>
-        <w:t xml:space="preserve"> The system takes your question and the retrieved text, and puts them together as context.</w:t>
-      </w:r>
-    </w:p>
-    <w:p>
-      <w:pPr>
-        <w:pStyle w:val="ListBullet"/>
-      </w:pPr>
-      <w:r>
-        <w:rPr>
-          <w:rFonts w:ascii="Arial" w:hAnsi="Arial"/>
-          <w:b/>
-          <w:sz w:val="22"/>
-        </w:rPr>
-        <w:t>Step 4:</w:t>
-      </w:r>
-      <w:r>
-        <w:rPr>
-          <w:rFonts w:ascii="Arial" w:hAnsi="Arial"/>
-          <w:sz w:val="22"/>
-        </w:rPr>
-        <w:t xml:space="preserve"> The LLM reads this combined context and generates a helpful, human-like response for you.</w:t>
+        <w:t>In many RAG systems, embeddings are stored in a vector database, which is a special type of database designed to store and search these number lists quickly. Other retrieval methods, such as simple keyword search, can also be used.</w:t>
       </w:r>
     </w:p>
     <w:p>
@@ -367,13 +383,13 @@
     </w:p>
     <w:p>
       <w:pPr>
-        <w:pStyle w:val="Heading1"/>
+        <w:pStyle w:val="Heading2"/>
       </w:pPr>
       <w:r>
         <w:rPr>
           <w:rFonts w:ascii="Arial" w:hAnsi="Arial"/>
         </w:rPr>
-        <w:t>4. A Simple Example</w:t>
+        <w:t>Step 3: Generation (Writing the Answer)</w:t>
       </w:r>
     </w:p>
     <w:p>
@@ -382,7 +398,18 @@
           <w:rFonts w:ascii="Arial" w:hAnsi="Arial"/>
           <w:sz w:val="22"/>
         </w:rPr>
-        <w:t>Let us look at a simple fictional example.</w:t>
+        <w:t>The system takes the user's question and the retrieved text, and gives both to the LLM. The retrieved information helps the model answer the question. The LLM then writes a clear, helpful reply for the user.</w:t>
+      </w:r>
+    </w:p>
+    <w:p>
+      <w:pPr>
+        <w:pStyle w:val="Heading1"/>
+      </w:pPr>
+      <w:r>
+        <w:rPr>
+          <w:rFonts w:ascii="Arial" w:hAnsi="Arial"/>
+        </w:rPr>
+        <w:t>4. Concrete Example</w:t>
       </w:r>
     </w:p>
     <w:p>
@@ -391,17 +418,7 @@
           <w:rFonts w:ascii="Arial" w:hAnsi="Arial"/>
           <w:sz w:val="22"/>
         </w:rPr>
-        <w:t>Imagine a fictional college that has a thick student rulebook. A student asks the college's AI chatbot: "What is the rule for a fee refund if I drop a class?"</w:t>
-      </w:r>
-    </w:p>
-    <w:p>
-      <w:r>
-        <w:rPr>
-          <w:rFonts w:ascii="Arial" w:hAnsi="Arial"/>
-          <w:b/>
-          <w:sz w:val="22"/>
-        </w:rPr>
-        <w:t>Without RAG:</w:t>
+        <w:t>Let us look at a fictional example to see this in action.</w:t>
       </w:r>
     </w:p>
     <w:p>
@@ -410,26 +427,107 @@
           <w:rFonts w:ascii="Arial" w:hAnsi="Arial"/>
           <w:sz w:val="22"/>
         </w:rPr>
-        <w:t>The chatbot does not have the rulebook. It uses its general training data. It might guess and say, "You get a full refund within 30 days," which could be completely wrong for this specific college.</w:t>
+        <w:t>Imagine a fictional college called Apex Institute.</w:t>
       </w:r>
     </w:p>
     <w:p>
+      <w:pPr>
+        <w:pStyle w:val="ListBullet"/>
+      </w:pPr>
       <w:r>
         <w:rPr>
           <w:rFonts w:ascii="Arial" w:hAnsi="Arial"/>
           <w:b/>
           <w:sz w:val="22"/>
         </w:rPr>
-        <w:t>With RAG:</w:t>
+        <w:t>1.</w:t>
       </w:r>
-    </w:p>
-    <w:p>
       <w:r>
         <w:rPr>
           <w:rFonts w:ascii="Arial" w:hAnsi="Arial"/>
           <w:sz w:val="22"/>
         </w:rPr>
-        <w:t>The system first searches the digital student rulebook for the words "fee refund" and "drop a class." It retrieves the exact rule: "Students receive a 50% refund if they drop a class within the first two weeks." The AI is given this rule as context. The AI then answers the student correctly: "According to the rulebook, you will get a 50% refund if you drop the class within the first two weeks."</w:t>
+        <w:t xml:space="preserve"> The college has a digital handbook with all exam rules. This is the knowledge base.</w:t>
+      </w:r>
+    </w:p>
+    <w:p>
+      <w:pPr>
+        <w:pStyle w:val="ListBullet"/>
+      </w:pPr>
+      <w:r>
+        <w:rPr>
+          <w:rFonts w:ascii="Arial" w:hAnsi="Arial"/>
+          <w:b/>
+          <w:sz w:val="22"/>
+        </w:rPr>
+        <w:t>2.</w:t>
+      </w:r>
+      <w:r>
+        <w:rPr>
+          <w:rFonts w:ascii="Arial" w:hAnsi="Arial"/>
+          <w:sz w:val="22"/>
+        </w:rPr>
+        <w:t xml:space="preserve"> A student asks: "What is the rule for late exam submission?"</w:t>
+      </w:r>
+    </w:p>
+    <w:p>
+      <w:pPr>
+        <w:pStyle w:val="ListBullet"/>
+      </w:pPr>
+      <w:r>
+        <w:rPr>
+          <w:rFonts w:ascii="Arial" w:hAnsi="Arial"/>
+          <w:b/>
+          <w:sz w:val="22"/>
+        </w:rPr>
+        <w:t>3.</w:t>
+      </w:r>
+      <w:r>
+        <w:rPr>
+          <w:rFonts w:ascii="Arial" w:hAnsi="Arial"/>
+          <w:sz w:val="22"/>
+        </w:rPr>
+        <w:t xml:space="preserve"> The RAG system performs retrieval. It searches the handbook and finds the exact paragraph about late exams.</w:t>
+      </w:r>
+    </w:p>
+    <w:p>
+      <w:pPr>
+        <w:pStyle w:val="ListBullet"/>
+      </w:pPr>
+      <w:r>
+        <w:rPr>
+          <w:rFonts w:ascii="Arial" w:hAnsi="Arial"/>
+          <w:b/>
+          <w:sz w:val="22"/>
+        </w:rPr>
+        <w:t>4.</w:t>
+      </w:r>
+      <w:r>
+        <w:rPr>
+          <w:rFonts w:ascii="Arial" w:hAnsi="Arial"/>
+          <w:sz w:val="22"/>
+        </w:rPr>
+        <w:t xml:space="preserve"> The system sends the student's question and that specific paragraph to the AI.</w:t>
+      </w:r>
+    </w:p>
+    <w:p>
+      <w:pPr>
+        <w:pStyle w:val="ListBullet"/>
+      </w:pPr>
+      <w:r>
+        <w:rPr>
+          <w:rFonts w:ascii="Arial" w:hAnsi="Arial"/>
+          <w:b/>
+          <w:sz w:val="22"/>
+        </w:rPr>
+        <w:t>5.</w:t>
+      </w:r>
+      <w:r>
+        <w:rPr>
+          <w:rFonts w:ascii="Arial" w:hAnsi="Arial"/>
+          <w:sz w:val="22"/>
+        </w:rPr>
+        <w:t xml:space="preserve"> The AI reads the paragraph and generates a polite, correct answer for the student.</w:t>
       </w:r>
     </w:p>
     <w:p>
@@ -479,7 +577,16 @@
         <w:rPr>
           <w:rFonts w:ascii="Arial" w:hAnsi="Arial"/>
         </w:rPr>
-        <w:t>5. Important Terms</w:t>
+        <w:t>5. Important Limitations</w:t>
+      </w:r>
+    </w:p>
+    <w:p>
+      <w:r>
+        <w:rPr>
+          <w:rFonts w:ascii="Arial" w:hAnsi="Arial"/>
+          <w:sz w:val="22"/>
+        </w:rPr>
+        <w:t>RAG is a wonderful tool, but it is not magic. You must remember these important points:</w:t>
       </w:r>
     </w:p>
     <w:p>
@@ -492,14 +599,14 @@
           <w:b/>
           <w:sz w:val="22"/>
         </w:rPr>
-        <w:t>RAG</w:t>
+        <w:t>Point 1:</w:t>
       </w:r>
       <w:r>
         <w:rPr>
           <w:rFonts w:ascii="Arial" w:hAnsi="Arial"/>
           <w:sz w:val="22"/>
         </w:rPr>
-        <w:t>: Retrieval-Augmented Generation. Connecting an AI to external documents before it answers.</w:t>
+        <w:t xml:space="preserve"> RAG does not guarantee that every answer is correct.</w:t>
       </w:r>
     </w:p>
     <w:p>
@@ -512,14 +619,14 @@
           <w:b/>
           <w:sz w:val="22"/>
         </w:rPr>
-        <w:t>LLM</w:t>
+        <w:t>Point 2:</w:t>
       </w:r>
       <w:r>
         <w:rPr>
           <w:rFonts w:ascii="Arial" w:hAnsi="Arial"/>
           <w:sz w:val="22"/>
         </w:rPr>
-        <w:t>: Large Language Model. A type of AI trained to understand and generate text.</w:t>
+        <w:t xml:space="preserve"> If the retrieval step finds the wrong document, the AI might still give a bad answer.</w:t>
       </w:r>
     </w:p>
     <w:p>
@@ -532,134 +639,14 @@
           <w:b/>
           <w:sz w:val="22"/>
         </w:rPr>
-        <w:t>Knowledge base</w:t>
+        <w:t>Point 3:</w:t>
       </w:r>
       <w:r>
         <w:rPr>
           <w:rFonts w:ascii="Arial" w:hAnsi="Arial"/>
           <w:sz w:val="22"/>
         </w:rPr>
-        <w:t>: A collected set of information, like a digital library or document folder.</w:t>
-      </w:r>
-    </w:p>
-    <w:p>
-      <w:pPr>
-        <w:pStyle w:val="ListBullet"/>
-      </w:pPr>
-      <w:r>
-        <w:rPr>
-          <w:rFonts w:ascii="Arial" w:hAnsi="Arial"/>
-          <w:b/>
-          <w:sz w:val="22"/>
-        </w:rPr>
-        <w:t>Retrieval</w:t>
-      </w:r>
-      <w:r>
-        <w:rPr>
-          <w:rFonts w:ascii="Arial" w:hAnsi="Arial"/>
-          <w:sz w:val="22"/>
-        </w:rPr>
-        <w:t>: Searching the knowledge base for relevant information.</w:t>
-      </w:r>
-    </w:p>
-    <w:p>
-      <w:pPr>
-        <w:pStyle w:val="ListBullet"/>
-      </w:pPr>
-      <w:r>
-        <w:rPr>
-          <w:rFonts w:ascii="Arial" w:hAnsi="Arial"/>
-          <w:b/>
-          <w:sz w:val="22"/>
-        </w:rPr>
-        <w:t>Embedding</w:t>
-      </w:r>
-      <w:r>
-        <w:rPr>
-          <w:rFonts w:ascii="Arial" w:hAnsi="Arial"/>
-          <w:sz w:val="22"/>
-        </w:rPr>
-        <w:t>: A piece of text converted into a list of numbers so the computer can search it quickly.</w:t>
-      </w:r>
-    </w:p>
-    <w:p>
-      <w:pPr>
-        <w:pStyle w:val="ListBullet"/>
-      </w:pPr>
-      <w:r>
-        <w:rPr>
-          <w:rFonts w:ascii="Arial" w:hAnsi="Arial"/>
-          <w:b/>
-          <w:sz w:val="22"/>
-        </w:rPr>
-        <w:t>Vector</w:t>
-      </w:r>
-      <w:r>
-        <w:rPr>
-          <w:rFonts w:ascii="Arial" w:hAnsi="Arial"/>
-          <w:sz w:val="22"/>
-        </w:rPr>
-        <w:t>: That exact list of numbers representing the text.</w:t>
-      </w:r>
-    </w:p>
-    <w:p>
-      <w:pPr>
-        <w:pStyle w:val="ListBullet"/>
-      </w:pPr>
-      <w:r>
-        <w:rPr>
-          <w:rFonts w:ascii="Arial" w:hAnsi="Arial"/>
-          <w:b/>
-          <w:sz w:val="22"/>
-        </w:rPr>
-        <w:t>Vector database</w:t>
-      </w:r>
-      <w:r>
-        <w:rPr>
-          <w:rFonts w:ascii="Arial" w:hAnsi="Arial"/>
-          <w:sz w:val="22"/>
-        </w:rPr>
-        <w:t>: A special type of storage designed to quickly compare vectors and find matching meanings.</w:t>
-      </w:r>
-    </w:p>
-    <w:p>
-      <w:pPr>
-        <w:pStyle w:val="ListBullet"/>
-      </w:pPr>
-      <w:r>
-        <w:rPr>
-          <w:rFonts w:ascii="Arial" w:hAnsi="Arial"/>
-          <w:b/>
-          <w:sz w:val="22"/>
-        </w:rPr>
-        <w:t>Context window</w:t>
-      </w:r>
-      <w:r>
-        <w:rPr>
-          <w:rFonts w:ascii="Arial" w:hAnsi="Arial"/>
-          <w:sz w:val="22"/>
-        </w:rPr>
-        <w:t>: The amount of information an AI model can read and consider at one time when generating an answer.</w:t>
-      </w:r>
-    </w:p>
-    <w:p>
-      <w:pPr>
-        <w:pStyle w:val="ListBullet"/>
-      </w:pPr>
-      <w:r>
-        <w:rPr>
-          <w:rFonts w:ascii="Arial" w:hAnsi="Arial"/>
-          <w:b/>
-          <w:sz w:val="22"/>
-        </w:rPr>
-        <w:t>Hallucination</w:t>
-      </w:r>
-      <w:r>
-        <w:rPr>
-          <w:rFonts w:ascii="Arial" w:hAnsi="Arial"/>
-          <w:sz w:val="22"/>
-        </w:rPr>
-        <w:t>: When an AI gives an answer that sounds confident but is actually incorrect or made-up.</w:t>
+        <w:t xml:space="preserve"> RAG can reduce the chance of unsupported answers, but it does not completely stop hallucinations.</w:t>
       </w:r>
     </w:p>
     <w:p>
@@ -670,87 +657,7 @@
         <w:rPr>
           <w:rFonts w:ascii="Arial" w:hAnsi="Arial"/>
         </w:rPr>
-        <w:t>6. Important Limitations</w:t>
-      </w:r>
-    </w:p>
-    <w:p>
-      <w:r>
-        <w:rPr>
-          <w:rFonts w:ascii="Arial" w:hAnsi="Arial"/>
-          <w:sz w:val="22"/>
-        </w:rPr>
-        <w:t>RAG is a powerful tool, but it is not magic. You should remember these important points:</w:t>
-      </w:r>
-    </w:p>
-    <w:p>
-      <w:pPr>
-        <w:pStyle w:val="ListBullet"/>
-      </w:pPr>
-      <w:r>
-        <w:rPr>
-          <w:rFonts w:ascii="Arial" w:hAnsi="Arial"/>
-          <w:b/>
-          <w:sz w:val="22"/>
-        </w:rPr>
-        <w:t>Retrieval quality matters:</w:t>
-      </w:r>
-      <w:r>
-        <w:rPr>
-          <w:rFonts w:ascii="Arial" w:hAnsi="Arial"/>
-          <w:sz w:val="22"/>
-        </w:rPr>
-        <w:t xml:space="preserve"> If the retrieved documents contain mistakes or are poorly written, the AI might still give a poor answer.</w:t>
-      </w:r>
-    </w:p>
-    <w:p>
-      <w:pPr>
-        <w:pStyle w:val="ListBullet"/>
-      </w:pPr>
-      <w:r>
-        <w:rPr>
-          <w:rFonts w:ascii="Arial" w:hAnsi="Arial"/>
-          <w:b/>
-          <w:sz w:val="22"/>
-        </w:rPr>
-        <w:t>Information can be incomplete:</w:t>
-      </w:r>
-      <w:r>
-        <w:rPr>
-          <w:rFonts w:ascii="Arial" w:hAnsi="Arial"/>
-          <w:sz w:val="22"/>
-        </w:rPr>
-        <w:t xml:space="preserve"> Sometimes the search might miss the right document, meaning the AI will not have the facts it needs.</w:t>
-      </w:r>
-    </w:p>
-    <w:p>
-      <w:pPr>
-        <w:pStyle w:val="ListBullet"/>
-      </w:pPr>
-      <w:r>
-        <w:rPr>
-          <w:rFonts w:ascii="Arial" w:hAnsi="Arial"/>
-          <w:b/>
-          <w:sz w:val="22"/>
-        </w:rPr>
-        <w:t>Does not completely stop hallucinations:</w:t>
-      </w:r>
-      <w:r>
-        <w:rPr>
-          <w:rFonts w:ascii="Arial" w:hAnsi="Arial"/>
-          <w:sz w:val="22"/>
-        </w:rPr>
-        <w:t xml:space="preserve"> While RAG reduces the chance of made-up answers, it does not guarantee a perfect answer every time. The AI can still misunderstand the retrieved text.</w:t>
-      </w:r>
-    </w:p>
-    <w:p>
-      <w:pPr>
-        <w:pStyle w:val="Heading1"/>
-      </w:pPr>
-      <w:r>
-        <w:rPr>
-          <w:rFonts w:ascii="Arial" w:hAnsi="Arial"/>
-        </w:rPr>
-        <w:t>7. Quick Summary</w:t>
+        <w:t>6. Summary / Key Takeaways</w:t>
       </w:r>
     </w:p>
     <w:p>
@@ -770,7 +677,7 @@
           <w:rFonts w:ascii="Arial" w:hAnsi="Arial"/>
           <w:sz w:val="22"/>
         </w:rPr>
-        <w:t xml:space="preserve"> RAG (Retrieval-Augmented Generation) is a technique that lets an AI look up facts from a knowledge base before answering a question.</w:t>
+        <w:t xml:space="preserve"> RAG (Retrieval-Augmented Generation) connects an AI model to an external source of information.</w:t>
       </w:r>
     </w:p>
     <w:p>
@@ -783,14 +690,14 @@
           <w:b/>
           <w:sz w:val="22"/>
         </w:rPr>
-        <w:t>Why:</w:t>
+        <w:t>How &amp; Why:</w:t>
       </w:r>
       <w:r>
         <w:rPr>
           <w:rFonts w:ascii="Arial" w:hAnsi="Arial"/>
           <w:sz w:val="22"/>
         </w:rPr>
-        <w:t xml:space="preserve"> It matters because it helps the AI provide accurate, up-to-date answers based on private or recent information, reducing hallucinations.</w:t>
+        <w:t xml:space="preserve"> Retrieval finds the right facts, and Generation writes the final answer. RAG can reduce hallucinations, but it does not completely eliminate them.</w:t>
       </w:r>
     </w:p>
     <w:p>
@@ -803,14 +710,14 @@
           <w:b/>
           <w:sz w:val="22"/>
         </w:rPr>
-        <w:t>How:</w:t>
+        <w:t>Key terms:</w:t>
       </w:r>
       <w:r>
         <w:rPr>
           <w:rFonts w:ascii="Arial" w:hAnsi="Arial"/>
           <w:sz w:val="22"/>
         </w:rPr>
-        <w:t xml:space="preserve"> A user asks a question, the system retrieves relevant documents, adds them as context, and the LLM generates a grounded answer.</w:t>
+        <w:t xml:space="preserve"> Embeddings and vectors help computers compare the meaning of words and find relevant text.</w:t>
       </w:r>
     </w:p>
     <w:sectPr>

</xml_diff>